<commit_message>
Enhance coffee menu prediction model with Top-k accuracy metrics and UI updates
- Added Top-k accuracy calculation in model evaluation.
- Updated app to display Top-k predictions and their probabilities.
- Enhanced styling for Top-k results in the UI.
- Modified project report to include Top-k accuracy metrics and explanations.
</commit_message>
<xml_diff>
--- a/รายงานโครงงาน_ML.docx
+++ b/รายงานโครงงาน_ML.docx
@@ -3427,7 +3427,21 @@
           <w:b w:val="0"/>
           <w:sz w:val="32"/>
         </w:rPr>
-        <w:t>•  Accuracy: สัดส่วนที่ทำนายถูกต้องจากทั้งหมด ใช้เป็นตัวชี้วัดหลักเพราะเข้าใจง่ายและเทียบกับ Baseline ได้ตรงไปตรงมา</w:t>
+        <w:t>•  Accuracy (Top-1): สัดส่วนที่ทำนายถูกต้องจากทั้งหมดเมื่อฟันธงคำตอบเดียว ใช้เป็นตัวชี้วัดหลัก เพราะเข้าใจง่ายและเทียบกับ Baseline ได้ตรงไปตรงมา</w:t>
+      </w:r>
+    </w:p>
+    <w:p>
+      <w:pPr>
+        <w:spacing w:after="80" w:lineRule="auto" w:line="360"/>
+        <w:ind w:left="510"/>
+      </w:pPr>
+      <w:r>
+        <w:rPr>
+          <w:rFonts w:ascii="TH Sarabun New" w:hAnsi="TH Sarabun New" w:eastAsia="TH Sarabun New" w:cs="TH Sarabun New"/>
+          <w:b w:val="0"/>
+          <w:sz w:val="32"/>
+        </w:rPr>
+        <w:t>•  Top-k Accuracy: สัดส่วนที่คำตอบจริงปรากฏอยู่ใน k อันดับแรกที่แบบจำลองให้ความน่าจะเป็นสูงสุด เหมาะกับระบบที่แสดงผลเป็น "รายการเมนูแนะนำ" หลายเมนูพร้อมกัน (เช่นหน้าเว็บของโครงงานนี้ที่ แสดงกราฟความน่าจะเป็นของทุกเมนู) แทนที่จะฟันธงคำตอบเดียว</w:t>
       </w:r>
     </w:p>
     <w:p>
@@ -3600,7 +3614,7 @@
                 <w:b w:val="0"/>
                 <w:sz w:val="30"/>
               </w:rPr>
-              <w:t>Accuracy (แบบจำลอง ก่อน Tuning)</w:t>
+              <w:t>Accuracy Top-1 (แบบจำลอง ก่อน Tuning)</w:t>
             </w:r>
           </w:p>
         </w:tc>
@@ -3666,6 +3680,360 @@
       <w:pPr>
         <w:spacing w:after="80"/>
       </w:pPr>
+    </w:p>
+    <w:p>
+      <w:pPr>
+        <w:spacing w:after="120" w:lineRule="auto" w:line="240" w:before="160"/>
+      </w:pPr>
+      <w:r>
+        <w:rPr>
+          <w:rFonts w:ascii="TH Sarabun New" w:hAnsi="TH Sarabun New" w:eastAsia="TH Sarabun New" w:cs="TH Sarabun New"/>
+          <w:b/>
+          <w:color w:val="6F4E37"/>
+          <w:sz w:val="36"/>
+        </w:rPr>
+        <w:t>7.2.1 Top-k Accuracy: มุมมองแบบ "เมนูแนะนำ"</w:t>
+      </w:r>
+    </w:p>
+    <w:p>
+      <w:pPr>
+        <w:spacing w:after="160" w:lineRule="auto" w:line="360"/>
+      </w:pPr>
+      <w:r>
+        <w:rPr>
+          <w:rFonts w:ascii="TH Sarabun New" w:hAnsi="TH Sarabun New" w:eastAsia="TH Sarabun New" w:cs="TH Sarabun New"/>
+          <w:b w:val="0"/>
+          <w:sz w:val="32"/>
+        </w:rPr>
+        <w:t>เนื่องจากหน้าเว็บของโครงงานนี้แสดงผลเป็นความน่าจะเป็นของเมนูทั้ง 8 ชนิดพร้อมกัน (ไม่ได้บังคับ ให้ผู้ใช้เชื่อคำตอบเดียว) จึงเพิ่มการวัดผลแบบ Top-k Accuracy คือตรวจสอบว่าคำตอบจริงอยู่ใน k อันดับแรกที่แบบจำลองให้ความน่าจะเป็นสูงสุดหรือไม่ ได้ผลดังนี้</w:t>
+      </w:r>
+    </w:p>
+    <w:tbl>
+      <w:tblPr>
+        <w:tblW w:type="auto" w:w="0"/>
+        <w:jc w:val="center"/>
+        <w:tblLook w:firstColumn="1" w:firstRow="1" w:lastColumn="0" w:lastRow="0" w:noHBand="0" w:noVBand="1" w:val="04A0"/>
+        <w:tblBorders>
+          <w:top w:val="single" w:sz="4" w:space="0" w:color="B8A68C"/>
+          <w:left w:val="single" w:sz="4" w:space="0" w:color="B8A68C"/>
+          <w:bottom w:val="single" w:sz="4" w:space="0" w:color="B8A68C"/>
+          <w:right w:val="single" w:sz="4" w:space="0" w:color="B8A68C"/>
+          <w:insideH w:val="single" w:sz="4" w:space="0" w:color="B8A68C"/>
+          <w:insideV w:val="single" w:sz="4" w:space="0" w:color="B8A68C"/>
+        </w:tblBorders>
+      </w:tblPr>
+      <w:tblGrid>
+        <w:gridCol w:w="2827"/>
+        <w:gridCol w:w="2827"/>
+        <w:gridCol w:w="2827"/>
+      </w:tblGrid>
+      <w:tr>
+        <w:tc>
+          <w:tcPr>
+            <w:tcW w:type="dxa" w:w="1701"/>
+            <w:shd w:val="clear" w:fill="6F4E37"/>
+          </w:tcPr>
+          <w:p>
+            <w:pPr>
+              <w:jc w:val="center"/>
+            </w:pPr>
+            <w:r/>
+            <w:r>
+              <w:rPr>
+                <w:rFonts w:ascii="TH Sarabun New" w:hAnsi="TH Sarabun New" w:eastAsia="TH Sarabun New" w:cs="TH Sarabun New"/>
+                <w:b/>
+                <w:color w:val="FFFFFF"/>
+                <w:sz w:val="32"/>
+              </w:rPr>
+              <w:t>วัดผลแบบ</w:t>
+            </w:r>
+          </w:p>
+        </w:tc>
+        <w:tc>
+          <w:tcPr>
+            <w:tcW w:type="dxa" w:w="3402"/>
+            <w:shd w:val="clear" w:fill="6F4E37"/>
+          </w:tcPr>
+          <w:p>
+            <w:pPr>
+              <w:jc w:val="center"/>
+            </w:pPr>
+            <w:r/>
+            <w:r>
+              <w:rPr>
+                <w:rFonts w:ascii="TH Sarabun New" w:hAnsi="TH Sarabun New" w:eastAsia="TH Sarabun New" w:cs="TH Sarabun New"/>
+                <w:b/>
+                <w:color w:val="FFFFFF"/>
+                <w:sz w:val="32"/>
+              </w:rPr>
+              <w:t>ความหมาย</w:t>
+            </w:r>
+          </w:p>
+        </w:tc>
+        <w:tc>
+          <w:tcPr>
+            <w:tcW w:type="dxa" w:w="3402"/>
+            <w:shd w:val="clear" w:fill="6F4E37"/>
+          </w:tcPr>
+          <w:p>
+            <w:pPr>
+              <w:jc w:val="center"/>
+            </w:pPr>
+            <w:r/>
+            <w:r>
+              <w:rPr>
+                <w:rFonts w:ascii="TH Sarabun New" w:hAnsi="TH Sarabun New" w:eastAsia="TH Sarabun New" w:cs="TH Sarabun New"/>
+                <w:b/>
+                <w:color w:val="FFFFFF"/>
+                <w:sz w:val="32"/>
+              </w:rPr>
+              <w:t>Accuracy</w:t>
+            </w:r>
+          </w:p>
+        </w:tc>
+      </w:tr>
+      <w:tr>
+        <w:tc>
+          <w:tcPr>
+            <w:tcW w:type="dxa" w:w="1701"/>
+          </w:tcPr>
+          <w:p>
+            <w:pPr>
+              <w:jc w:val="left"/>
+            </w:pPr>
+            <w:r>
+              <w:rPr>
+                <w:rFonts w:ascii="TH Sarabun New" w:hAnsi="TH Sarabun New" w:eastAsia="TH Sarabun New" w:cs="TH Sarabun New"/>
+                <w:b w:val="0"/>
+                <w:sz w:val="30"/>
+              </w:rPr>
+              <w:t>Top-1</w:t>
+            </w:r>
+          </w:p>
+        </w:tc>
+        <w:tc>
+          <w:tcPr>
+            <w:tcW w:type="dxa" w:w="3402"/>
+          </w:tcPr>
+          <w:p>
+            <w:pPr>
+              <w:jc w:val="center"/>
+            </w:pPr>
+            <w:r>
+              <w:rPr>
+                <w:rFonts w:ascii="TH Sarabun New" w:hAnsi="TH Sarabun New" w:eastAsia="TH Sarabun New" w:cs="TH Sarabun New"/>
+                <w:b w:val="0"/>
+                <w:sz w:val="30"/>
+              </w:rPr>
+              <w:t>ทายเมนูเดียว</w:t>
+            </w:r>
+          </w:p>
+        </w:tc>
+        <w:tc>
+          <w:tcPr>
+            <w:tcW w:type="dxa" w:w="3402"/>
+          </w:tcPr>
+          <w:p>
+            <w:pPr>
+              <w:jc w:val="center"/>
+            </w:pPr>
+            <w:r>
+              <w:rPr>
+                <w:rFonts w:ascii="TH Sarabun New" w:hAnsi="TH Sarabun New" w:eastAsia="TH Sarabun New" w:cs="TH Sarabun New"/>
+                <w:b w:val="0"/>
+                <w:sz w:val="30"/>
+              </w:rPr>
+              <w:t>28.6%</w:t>
+            </w:r>
+          </w:p>
+        </w:tc>
+      </w:tr>
+      <w:tr>
+        <w:tc>
+          <w:tcPr>
+            <w:tcW w:type="dxa" w:w="1701"/>
+          </w:tcPr>
+          <w:p>
+            <w:pPr>
+              <w:jc w:val="left"/>
+            </w:pPr>
+            <w:r>
+              <w:rPr>
+                <w:rFonts w:ascii="TH Sarabun New" w:hAnsi="TH Sarabun New" w:eastAsia="TH Sarabun New" w:cs="TH Sarabun New"/>
+                <w:b w:val="0"/>
+                <w:sz w:val="30"/>
+              </w:rPr>
+              <w:t>Top-2</w:t>
+            </w:r>
+          </w:p>
+        </w:tc>
+        <w:tc>
+          <w:tcPr>
+            <w:tcW w:type="dxa" w:w="3402"/>
+          </w:tcPr>
+          <w:p>
+            <w:pPr>
+              <w:jc w:val="center"/>
+            </w:pPr>
+            <w:r>
+              <w:rPr>
+                <w:rFonts w:ascii="TH Sarabun New" w:hAnsi="TH Sarabun New" w:eastAsia="TH Sarabun New" w:cs="TH Sarabun New"/>
+                <w:b w:val="0"/>
+                <w:sz w:val="30"/>
+              </w:rPr>
+              <w:t>แนะนำ 2 เมนู</w:t>
+            </w:r>
+          </w:p>
+        </w:tc>
+        <w:tc>
+          <w:tcPr>
+            <w:tcW w:type="dxa" w:w="3402"/>
+          </w:tcPr>
+          <w:p>
+            <w:pPr>
+              <w:jc w:val="center"/>
+            </w:pPr>
+            <w:r>
+              <w:rPr>
+                <w:rFonts w:ascii="TH Sarabun New" w:hAnsi="TH Sarabun New" w:eastAsia="TH Sarabun New" w:cs="TH Sarabun New"/>
+                <w:b w:val="0"/>
+                <w:sz w:val="30"/>
+              </w:rPr>
+              <w:t>51.1%</w:t>
+            </w:r>
+          </w:p>
+        </w:tc>
+      </w:tr>
+      <w:tr>
+        <w:tc>
+          <w:tcPr>
+            <w:tcW w:type="dxa" w:w="1701"/>
+          </w:tcPr>
+          <w:p>
+            <w:pPr>
+              <w:jc w:val="left"/>
+            </w:pPr>
+            <w:r>
+              <w:rPr>
+                <w:rFonts w:ascii="TH Sarabun New" w:hAnsi="TH Sarabun New" w:eastAsia="TH Sarabun New" w:cs="TH Sarabun New"/>
+                <w:b w:val="0"/>
+                <w:sz w:val="30"/>
+              </w:rPr>
+              <w:t>Top-3</w:t>
+            </w:r>
+          </w:p>
+        </w:tc>
+        <w:tc>
+          <w:tcPr>
+            <w:tcW w:type="dxa" w:w="3402"/>
+          </w:tcPr>
+          <w:p>
+            <w:pPr>
+              <w:jc w:val="center"/>
+            </w:pPr>
+            <w:r>
+              <w:rPr>
+                <w:rFonts w:ascii="TH Sarabun New" w:hAnsi="TH Sarabun New" w:eastAsia="TH Sarabun New" w:cs="TH Sarabun New"/>
+                <w:b w:val="0"/>
+                <w:sz w:val="30"/>
+              </w:rPr>
+              <w:t>แนะนำ 3 เมนู</w:t>
+            </w:r>
+          </w:p>
+        </w:tc>
+        <w:tc>
+          <w:tcPr>
+            <w:tcW w:type="dxa" w:w="3402"/>
+          </w:tcPr>
+          <w:p>
+            <w:pPr>
+              <w:jc w:val="center"/>
+            </w:pPr>
+            <w:r>
+              <w:rPr>
+                <w:rFonts w:ascii="TH Sarabun New" w:hAnsi="TH Sarabun New" w:eastAsia="TH Sarabun New" w:cs="TH Sarabun New"/>
+                <w:b w:val="0"/>
+                <w:sz w:val="30"/>
+              </w:rPr>
+              <w:t>66.3%</w:t>
+            </w:r>
+          </w:p>
+        </w:tc>
+      </w:tr>
+      <w:tr>
+        <w:tc>
+          <w:tcPr>
+            <w:tcW w:type="dxa" w:w="1701"/>
+          </w:tcPr>
+          <w:p>
+            <w:pPr>
+              <w:jc w:val="left"/>
+            </w:pPr>
+            <w:r>
+              <w:rPr>
+                <w:rFonts w:ascii="TH Sarabun New" w:hAnsi="TH Sarabun New" w:eastAsia="TH Sarabun New" w:cs="TH Sarabun New"/>
+                <w:b w:val="0"/>
+                <w:sz w:val="30"/>
+              </w:rPr>
+              <w:t>Top-4</w:t>
+            </w:r>
+          </w:p>
+        </w:tc>
+        <w:tc>
+          <w:tcPr>
+            <w:tcW w:type="dxa" w:w="3402"/>
+          </w:tcPr>
+          <w:p>
+            <w:pPr>
+              <w:jc w:val="center"/>
+            </w:pPr>
+            <w:r>
+              <w:rPr>
+                <w:rFonts w:ascii="TH Sarabun New" w:hAnsi="TH Sarabun New" w:eastAsia="TH Sarabun New" w:cs="TH Sarabun New"/>
+                <w:b w:val="0"/>
+                <w:sz w:val="30"/>
+              </w:rPr>
+              <w:t>แนะนำ 4 เมนู</w:t>
+            </w:r>
+          </w:p>
+        </w:tc>
+        <w:tc>
+          <w:tcPr>
+            <w:tcW w:type="dxa" w:w="3402"/>
+          </w:tcPr>
+          <w:p>
+            <w:pPr>
+              <w:jc w:val="center"/>
+            </w:pPr>
+            <w:r>
+              <w:rPr>
+                <w:rFonts w:ascii="TH Sarabun New" w:hAnsi="TH Sarabun New" w:eastAsia="TH Sarabun New" w:cs="TH Sarabun New"/>
+                <w:b w:val="0"/>
+                <w:sz w:val="30"/>
+              </w:rPr>
+              <w:t>77.6%</w:t>
+            </w:r>
+          </w:p>
+        </w:tc>
+      </w:tr>
+    </w:tbl>
+    <w:p>
+      <w:pPr>
+        <w:spacing w:after="80"/>
+      </w:pPr>
+    </w:p>
+    <w:p>
+      <w:pPr>
+        <w:spacing w:after="160" w:lineRule="auto" w:line="360"/>
+      </w:pPr>
+      <w:r>
+        <w:rPr>
+          <w:rFonts w:ascii="TH Sarabun New" w:hAnsi="TH Sarabun New" w:eastAsia="TH Sarabun New" w:cs="TH Sarabun New"/>
+          <w:b w:val="0"/>
+          <w:sz w:val="32"/>
+        </w:rPr>
+        <w:t>ผลลัพธ์แสดงว่าหากปรับกรอบการใช้งานจาก "ทายเมนูเดียวให้ถูก" เป็น "แนะนำเมนูที่เป็นไปได้ 4 อันดับแรก" (ตรงกับที่หน้าเว็บไฮไลต์แถบสีเข้ม 4 อันดับแรกให้ผู้ใช้เห็น) แบบจำลองจะครอบคลุม คำตอบจริงได้ถึง 77.6% ซึ่งสูงกว่า Top-1 Accuracy มาก การเพิ่มตัวชี้วัดนี้ไม่ได้เปลี่ยนแปลง ความสามารถที่แท้จริงของแบบจำลอง แต่เป็นการเลือกมุมมองการนำเสนอผลลัพธ์ที่เหมาะสมกับลักษณะ การใช้งานจริงมากกว่า (ระบบแนะนำ ไม่ใช่ระบบฟันธงคำตอบเดียว)</w:t>
+      </w:r>
     </w:p>
     <w:p>
       <w:pPr>
@@ -4145,9 +4513,10 @@
         </w:tblBorders>
       </w:tblPr>
       <w:tblGrid>
-        <w:gridCol w:w="2827"/>
-        <w:gridCol w:w="2827"/>
-        <w:gridCol w:w="2827"/>
+        <w:gridCol w:w="2120"/>
+        <w:gridCol w:w="2120"/>
+        <w:gridCol w:w="2120"/>
+        <w:gridCol w:w="2120"/>
       </w:tblGrid>
       <w:tr>
         <w:tc>
@@ -4173,7 +4542,7 @@
         </w:tc>
         <w:tc>
           <w:tcPr>
-            <w:tcW w:type="dxa" w:w="4535"/>
+            <w:tcW w:type="dxa" w:w="3685"/>
             <w:shd w:val="clear" w:fill="6F4E37"/>
           </w:tcPr>
           <w:p>
@@ -4194,7 +4563,7 @@
         </w:tc>
         <w:tc>
           <w:tcPr>
-            <w:tcW w:type="dxa" w:w="2835"/>
+            <w:tcW w:type="dxa" w:w="1984"/>
             <w:shd w:val="clear" w:fill="6F4E37"/>
           </w:tcPr>
           <w:p>
@@ -4210,6 +4579,27 @@
                 <w:sz w:val="32"/>
               </w:rPr>
               <w:t>ความน่าจะเป็น</w:t>
+            </w:r>
+          </w:p>
+        </w:tc>
+        <w:tc>
+          <w:tcPr>
+            <w:tcW w:type="dxa" w:w="1701"/>
+            <w:shd w:val="clear" w:fill="6F4E37"/>
+          </w:tcPr>
+          <w:p>
+            <w:pPr>
+              <w:jc w:val="center"/>
+            </w:pPr>
+            <w:r/>
+            <w:r>
+              <w:rPr>
+                <w:rFonts w:ascii="TH Sarabun New" w:hAnsi="TH Sarabun New" w:eastAsia="TH Sarabun New" w:cs="TH Sarabun New"/>
+                <w:b/>
+                <w:color w:val="FFFFFF"/>
+                <w:sz w:val="32"/>
+              </w:rPr>
+              <w:t>อยู่ใน Top-4 แนะนำ?</w:t>
             </w:r>
           </w:p>
         </w:tc>
@@ -4235,7 +4625,7 @@
         </w:tc>
         <w:tc>
           <w:tcPr>
-            <w:tcW w:type="dxa" w:w="4535"/>
+            <w:tcW w:type="dxa" w:w="3685"/>
           </w:tcPr>
           <w:p>
             <w:pPr>
@@ -4253,7 +4643,7 @@
         </w:tc>
         <w:tc>
           <w:tcPr>
-            <w:tcW w:type="dxa" w:w="2835"/>
+            <w:tcW w:type="dxa" w:w="1984"/>
           </w:tcPr>
           <w:p>
             <w:pPr>
@@ -4266,6 +4656,24 @@
                 <w:sz w:val="30"/>
               </w:rPr>
               <w:t>29.6%</w:t>
+            </w:r>
+          </w:p>
+        </w:tc>
+        <w:tc>
+          <w:tcPr>
+            <w:tcW w:type="dxa" w:w="1701"/>
+          </w:tcPr>
+          <w:p>
+            <w:pPr>
+              <w:jc w:val="center"/>
+            </w:pPr>
+            <w:r>
+              <w:rPr>
+                <w:rFonts w:ascii="TH Sarabun New" w:hAnsi="TH Sarabun New" w:eastAsia="TH Sarabun New" w:cs="TH Sarabun New"/>
+                <w:b w:val="0"/>
+                <w:sz w:val="30"/>
+              </w:rPr>
+              <w:t>✓</w:t>
             </w:r>
           </w:p>
         </w:tc>
@@ -4291,7 +4699,7 @@
         </w:tc>
         <w:tc>
           <w:tcPr>
-            <w:tcW w:type="dxa" w:w="4535"/>
+            <w:tcW w:type="dxa" w:w="3685"/>
           </w:tcPr>
           <w:p>
             <w:pPr>
@@ -4309,7 +4717,7 @@
         </w:tc>
         <w:tc>
           <w:tcPr>
-            <w:tcW w:type="dxa" w:w="2835"/>
+            <w:tcW w:type="dxa" w:w="1984"/>
           </w:tcPr>
           <w:p>
             <w:pPr>
@@ -4322,6 +4730,24 @@
                 <w:sz w:val="30"/>
               </w:rPr>
               <w:t>23.1%</w:t>
+            </w:r>
+          </w:p>
+        </w:tc>
+        <w:tc>
+          <w:tcPr>
+            <w:tcW w:type="dxa" w:w="1701"/>
+          </w:tcPr>
+          <w:p>
+            <w:pPr>
+              <w:jc w:val="center"/>
+            </w:pPr>
+            <w:r>
+              <w:rPr>
+                <w:rFonts w:ascii="TH Sarabun New" w:hAnsi="TH Sarabun New" w:eastAsia="TH Sarabun New" w:cs="TH Sarabun New"/>
+                <w:b w:val="0"/>
+                <w:sz w:val="30"/>
+              </w:rPr>
+              <w:t>✓</w:t>
             </w:r>
           </w:p>
         </w:tc>
@@ -4347,7 +4773,7 @@
         </w:tc>
         <w:tc>
           <w:tcPr>
-            <w:tcW w:type="dxa" w:w="4535"/>
+            <w:tcW w:type="dxa" w:w="3685"/>
           </w:tcPr>
           <w:p>
             <w:pPr>
@@ -4365,7 +4791,7 @@
         </w:tc>
         <w:tc>
           <w:tcPr>
-            <w:tcW w:type="dxa" w:w="2835"/>
+            <w:tcW w:type="dxa" w:w="1984"/>
           </w:tcPr>
           <w:p>
             <w:pPr>
@@ -4378,6 +4804,24 @@
                 <w:sz w:val="30"/>
               </w:rPr>
               <w:t>14.6%</w:t>
+            </w:r>
+          </w:p>
+        </w:tc>
+        <w:tc>
+          <w:tcPr>
+            <w:tcW w:type="dxa" w:w="1701"/>
+          </w:tcPr>
+          <w:p>
+            <w:pPr>
+              <w:jc w:val="center"/>
+            </w:pPr>
+            <w:r>
+              <w:rPr>
+                <w:rFonts w:ascii="TH Sarabun New" w:hAnsi="TH Sarabun New" w:eastAsia="TH Sarabun New" w:cs="TH Sarabun New"/>
+                <w:b w:val="0"/>
+                <w:sz w:val="30"/>
+              </w:rPr>
+              <w:t>✓</w:t>
             </w:r>
           </w:p>
         </w:tc>
@@ -4403,7 +4847,7 @@
         </w:tc>
         <w:tc>
           <w:tcPr>
-            <w:tcW w:type="dxa" w:w="4535"/>
+            <w:tcW w:type="dxa" w:w="3685"/>
           </w:tcPr>
           <w:p>
             <w:pPr>
@@ -4421,7 +4865,7 @@
         </w:tc>
         <w:tc>
           <w:tcPr>
-            <w:tcW w:type="dxa" w:w="2835"/>
+            <w:tcW w:type="dxa" w:w="1984"/>
           </w:tcPr>
           <w:p>
             <w:pPr>
@@ -4434,6 +4878,24 @@
                 <w:sz w:val="30"/>
               </w:rPr>
               <w:t>11.1%</w:t>
+            </w:r>
+          </w:p>
+        </w:tc>
+        <w:tc>
+          <w:tcPr>
+            <w:tcW w:type="dxa" w:w="1701"/>
+          </w:tcPr>
+          <w:p>
+            <w:pPr>
+              <w:jc w:val="center"/>
+            </w:pPr>
+            <w:r>
+              <w:rPr>
+                <w:rFonts w:ascii="TH Sarabun New" w:hAnsi="TH Sarabun New" w:eastAsia="TH Sarabun New" w:cs="TH Sarabun New"/>
+                <w:b w:val="0"/>
+                <w:sz w:val="30"/>
+              </w:rPr>
+              <w:t>✓</w:t>
             </w:r>
           </w:p>
         </w:tc>
@@ -4459,7 +4921,7 @@
         </w:tc>
         <w:tc>
           <w:tcPr>
-            <w:tcW w:type="dxa" w:w="4535"/>
+            <w:tcW w:type="dxa" w:w="3685"/>
           </w:tcPr>
           <w:p>
             <w:pPr>
@@ -4477,7 +4939,7 @@
         </w:tc>
         <w:tc>
           <w:tcPr>
-            <w:tcW w:type="dxa" w:w="2835"/>
+            <w:tcW w:type="dxa" w:w="1984"/>
           </w:tcPr>
           <w:p>
             <w:pPr>
@@ -4490,6 +4952,23 @@
                 <w:sz w:val="30"/>
               </w:rPr>
               <w:t>10.2%</w:t>
+            </w:r>
+          </w:p>
+        </w:tc>
+        <w:tc>
+          <w:tcPr>
+            <w:tcW w:type="dxa" w:w="1701"/>
+          </w:tcPr>
+          <w:p>
+            <w:pPr>
+              <w:jc w:val="center"/>
+            </w:pPr>
+            <w:r>
+              <w:rPr>
+                <w:rFonts w:ascii="TH Sarabun New" w:hAnsi="TH Sarabun New" w:eastAsia="TH Sarabun New" w:cs="TH Sarabun New"/>
+                <w:b w:val="0"/>
+                <w:sz w:val="30"/>
+              </w:rPr>
             </w:r>
           </w:p>
         </w:tc>
@@ -4515,7 +4994,7 @@
         </w:tc>
         <w:tc>
           <w:tcPr>
-            <w:tcW w:type="dxa" w:w="4535"/>
+            <w:tcW w:type="dxa" w:w="3685"/>
           </w:tcPr>
           <w:p>
             <w:pPr>
@@ -4533,7 +5012,7 @@
         </w:tc>
         <w:tc>
           <w:tcPr>
-            <w:tcW w:type="dxa" w:w="2835"/>
+            <w:tcW w:type="dxa" w:w="1984"/>
           </w:tcPr>
           <w:p>
             <w:pPr>
@@ -4546,6 +5025,23 @@
                 <w:sz w:val="30"/>
               </w:rPr>
               <w:t>8.3%</w:t>
+            </w:r>
+          </w:p>
+        </w:tc>
+        <w:tc>
+          <w:tcPr>
+            <w:tcW w:type="dxa" w:w="1701"/>
+          </w:tcPr>
+          <w:p>
+            <w:pPr>
+              <w:jc w:val="center"/>
+            </w:pPr>
+            <w:r>
+              <w:rPr>
+                <w:rFonts w:ascii="TH Sarabun New" w:hAnsi="TH Sarabun New" w:eastAsia="TH Sarabun New" w:cs="TH Sarabun New"/>
+                <w:b w:val="0"/>
+                <w:sz w:val="30"/>
+              </w:rPr>
             </w:r>
           </w:p>
         </w:tc>
@@ -4571,7 +5067,7 @@
         </w:tc>
         <w:tc>
           <w:tcPr>
-            <w:tcW w:type="dxa" w:w="4535"/>
+            <w:tcW w:type="dxa" w:w="3685"/>
           </w:tcPr>
           <w:p>
             <w:pPr>
@@ -4589,7 +5085,7 @@
         </w:tc>
         <w:tc>
           <w:tcPr>
-            <w:tcW w:type="dxa" w:w="2835"/>
+            <w:tcW w:type="dxa" w:w="1984"/>
           </w:tcPr>
           <w:p>
             <w:pPr>
@@ -4602,6 +5098,23 @@
                 <w:sz w:val="30"/>
               </w:rPr>
               <w:t>3.0%</w:t>
+            </w:r>
+          </w:p>
+        </w:tc>
+        <w:tc>
+          <w:tcPr>
+            <w:tcW w:type="dxa" w:w="1701"/>
+          </w:tcPr>
+          <w:p>
+            <w:pPr>
+              <w:jc w:val="center"/>
+            </w:pPr>
+            <w:r>
+              <w:rPr>
+                <w:rFonts w:ascii="TH Sarabun New" w:hAnsi="TH Sarabun New" w:eastAsia="TH Sarabun New" w:cs="TH Sarabun New"/>
+                <w:b w:val="0"/>
+                <w:sz w:val="30"/>
+              </w:rPr>
             </w:r>
           </w:p>
         </w:tc>
@@ -4627,7 +5140,7 @@
         </w:tc>
         <w:tc>
           <w:tcPr>
-            <w:tcW w:type="dxa" w:w="4535"/>
+            <w:tcW w:type="dxa" w:w="3685"/>
           </w:tcPr>
           <w:p>
             <w:pPr>
@@ -4645,7 +5158,7 @@
         </w:tc>
         <w:tc>
           <w:tcPr>
-            <w:tcW w:type="dxa" w:w="2835"/>
+            <w:tcW w:type="dxa" w:w="1984"/>
           </w:tcPr>
           <w:p>
             <w:pPr>
@@ -4658,6 +5171,23 @@
                 <w:sz w:val="30"/>
               </w:rPr>
               <w:t>0.2%</w:t>
+            </w:r>
+          </w:p>
+        </w:tc>
+        <w:tc>
+          <w:tcPr>
+            <w:tcW w:type="dxa" w:w="1701"/>
+          </w:tcPr>
+          <w:p>
+            <w:pPr>
+              <w:jc w:val="center"/>
+            </w:pPr>
+            <w:r>
+              <w:rPr>
+                <w:rFonts w:ascii="TH Sarabun New" w:hAnsi="TH Sarabun New" w:eastAsia="TH Sarabun New" w:cs="TH Sarabun New"/>
+                <w:b w:val="0"/>
+                <w:sz w:val="30"/>
+              </w:rPr>
             </w:r>
           </w:p>
         </w:tc>
@@ -4678,7 +5208,7 @@
           <w:b w:val="0"/>
           <w:sz w:val="32"/>
         </w:rPr>
-        <w:t>จะเห็นว่าในเดือนพฤศจิกายนช่วงกลางคืน แบบจำลองให้ความน่าจะเป็นของเมนูร้อนอย่าง Hot Chocolate และ Cocoa รวมกันสูงถึง 22.9% ซึ่งสูงกว่าค่าเฉลี่ยของทั้งชุดข้อมูล (รวมกันประมาณ 14.5%) สอดคล้องกับพฤติกรรมการดื่มเครื่องดื่มร้อนในช่วงอากาศเย็น</w:t>
+        <w:t>จะเห็นว่าในเดือนพฤศจิกายนช่วงกลางคืน แบบจำลองให้ความน่าจะเป็นของเมนูร้อนอย่าง Hot Chocolate และ Cocoa รวมกันสูงถึง 22.9% ซึ่งสูงกว่าค่าเฉลี่ยของทั้งชุดข้อมูล (รวมกันประมาณ 14.5%) สอดคล้องกับพฤติกรรมการดื่มเครื่องดื่มร้อนในช่วงอากาศเย็น หน้าเว็บของโครงงานจะไฮไลต์ แถบสีเข้มให้กับ 4 อันดับแรกโดยอัตโนมัติ (คอลัมน์ขวาสุดในตาราง) เพื่อสื่อสารกับผู้ใช้ว่านี่คือ "กลุ่มเมนูแนะนำ" ที่ครอบคลุมคำตอบจริงได้ประมาณ 77.6% ของเวลา แทนที่จะให้ผู้ใช้ยึดติดกับเมนู อันดับ 1 เพียงเมนูเดียว</w:t>
       </w:r>
     </w:p>
     <w:p>
@@ -4848,7 +5378,7 @@
           <w:b w:val="0"/>
           <w:sz w:val="32"/>
         </w:rPr>
-        <w:t>โครงงานนี้พัฒนาแบบจำลอง Machine Learning ประเภท Multi-class Classification เพื่อทำนายเมนู กาแฟที่ลูกค้ามีแนวโน้มจะสั่งซื้อ โดยใช้ข้อมูลวัน เดือน และช่วงเวลาของวัน แบบจำลองที่พัฒนา ด้วย Gradient Boosting Classifier ให้ความแม่นยำ 28.6% บนชุดข้อมูลทดสอบ ซึ่งสูงกว่าวิธี อ้างอิงพื้นฐาน (เดาเมนูที่ขายดีที่สุดเสมอ) ที่ทำได้ 22.8% และได้พัฒนาเว็บแอปพลิเคชันต้นแบบ ที่ให้ผู้ใช้งานทดลองป้อนวัน/เดือน/ช่วงเวลา แล้วดูผลการทำนายแบบโต้ตอบได้จริง</w:t>
+        <w:t>โครงงานนี้พัฒนาแบบจำลอง Machine Learning ประเภท Multi-class Classification เพื่อทำนายเมนู กาแฟที่ลูกค้ามีแนวโน้มจะสั่งซื้อ โดยใช้ข้อมูลวัน เดือน และช่วงเวลาของวัน แบบจำลองที่พัฒนา ด้วย Gradient Boosting Classifier ให้ความแม่นยำแบบ Top-1 อยู่ที่ 28.6% บนชุดข้อมูลทดสอบ ซึ่งสูงกว่าวิธีอ้างอิงพื้นฐาน (เดาเมนูที่ขายดีที่สุดเสมอ) ที่ทำได้ 22.8% และหากมองในมุมของ ระบบแนะนำเมนู (Top-4 Accuracy) แบบจำลองครอบคลุมคำตอบจริงได้สูงถึง 77.6% และได้พัฒนา เว็บแอปพลิเคชันต้นแบบที่ให้ผู้ใช้งานทดลองป้อนวัน/เดือน/ช่วงเวลา แล้วดูผลการทำนายแบบโต้ตอบ ได้จริง พร้อมไฮไลต์เมนูแนะนำ 4 อันดับแรกให้เห็นชัดเจน</w:t>
       </w:r>
     </w:p>
     <w:p>

</xml_diff>